<commit_message>
Agrega mapa y graficos al informe PAER, segun la nueva convencion
El informe ya tenia las tablas; le faltaba el mapa coropletico y los
graficos que pide la convencion agregada en analisis/README.md.
Resalta los 11 municipios (PCC + Buenaventura) sobre el contexto de
los 42 del Valle, reusando el patron de geometria/rotulo de
mapas_turismo.py. Deja el script y las figuras en
analisis/impacto_sismo/paer_pcc_buenaventura/ para reutilizar.

Co-Authored-By: Claude Sonnet 5 <noreply@anthropic.com>
</commit_message>
<xml_diff>
--- a/informes/Informe_turismo_PCC_Buenaventura_PAER_2026-10-21.docx
+++ b/informes/Informe_turismo_PCC_Buenaventura_PAER_2026-10-21.docx
@@ -190,6 +190,50 @@
       </w:pPr>
       <w:r>
         <w:t>3. Datos por municipio</w:t>
+      </w:r>
+    </w:p>
+    <w:p>
+      <w:r>
+        <w:t>El mapa y los gráficos siguientes resumen visualmente la tabla detallada de la sección 3.1; todas las cifras provienen de la misma fuente y fecha de corte.</w:t>
+      </w:r>
+    </w:p>
+    <w:p>
+      <w:pPr>
+        <w:jc w:val="center"/>
+      </w:pPr>
+      <w:r>
+        <w:drawing>
+          <wp:inline xmlns:a="http://schemas.openxmlformats.org/drawingml/2006/main" xmlns:pic="http://schemas.openxmlformats.org/drawingml/2006/picture">
+            <wp:extent cx="5760720" cy="4788298"/>
+            <wp:docPr id="1" name="Picture 1"/>
+            <wp:cNvGraphicFramePr>
+              <a:graphicFrameLocks noChangeAspect="1"/>
+            </wp:cNvGraphicFramePr>
+            <a:graphic>
+              <a:graphicData uri="http://schemas.openxmlformats.org/drawingml/2006/picture">
+                <pic:pic>
+                  <pic:nvPicPr>
+                    <pic:cNvPr id="0" name="fig1_mapa_pcc.png"/>
+                    <pic:cNvPicPr/>
+                  </pic:nvPicPr>
+                  <pic:blipFill>
+                    <a:blip r:embed="rId9"/>
+                    <a:stretch>
+                      <a:fillRect/>
+                    </a:stretch>
+                  </pic:blipFill>
+                  <pic:spPr>
+                    <a:xfrm>
+                      <a:off x="0" y="0"/>
+                      <a:ext cx="5760720" cy="4788298"/>
+                    </a:xfrm>
+                    <a:prstGeom prst="rect"/>
+                  </pic:spPr>
+                </pic:pic>
+              </a:graphicData>
+            </a:graphic>
+          </wp:inline>
+        </w:drawing>
       </w:r>
     </w:p>
     <w:p>
@@ -2102,6 +2146,84 @@
     </w:p>
     <w:p>
       <w:pPr>
+        <w:jc w:val="center"/>
+      </w:pPr>
+      <w:r>
+        <w:drawing>
+          <wp:inline xmlns:a="http://schemas.openxmlformats.org/drawingml/2006/main" xmlns:pic="http://schemas.openxmlformats.org/drawingml/2006/picture">
+            <wp:extent cx="6035040" cy="3517896"/>
+            <wp:docPr id="2" name="Picture 2"/>
+            <wp:cNvGraphicFramePr>
+              <a:graphicFrameLocks noChangeAspect="1"/>
+            </wp:cNvGraphicFramePr>
+            <a:graphic>
+              <a:graphicData uri="http://schemas.openxmlformats.org/drawingml/2006/picture">
+                <pic:pic>
+                  <pic:nvPicPr>
+                    <pic:cNvPr id="0" name="fig2_severidad.png"/>
+                    <pic:cNvPicPr/>
+                  </pic:nvPicPr>
+                  <pic:blipFill>
+                    <a:blip r:embed="rId10"/>
+                    <a:stretch>
+                      <a:fillRect/>
+                    </a:stretch>
+                  </pic:blipFill>
+                  <pic:spPr>
+                    <a:xfrm>
+                      <a:off x="0" y="0"/>
+                      <a:ext cx="6035040" cy="3517896"/>
+                    </a:xfrm>
+                    <a:prstGeom prst="rect"/>
+                  </pic:spPr>
+                </pic:pic>
+              </a:graphicData>
+            </a:graphic>
+          </wp:inline>
+        </w:drawing>
+      </w:r>
+    </w:p>
+    <w:p>
+      <w:pPr>
+        <w:jc w:val="center"/>
+      </w:pPr>
+      <w:r>
+        <w:drawing>
+          <wp:inline xmlns:a="http://schemas.openxmlformats.org/drawingml/2006/main" xmlns:pic="http://schemas.openxmlformats.org/drawingml/2006/picture">
+            <wp:extent cx="6035040" cy="3821530"/>
+            <wp:docPr id="3" name="Picture 3"/>
+            <wp:cNvGraphicFramePr>
+              <a:graphicFrameLocks noChangeAspect="1"/>
+            </wp:cNvGraphicFramePr>
+            <a:graphic>
+              <a:graphicData uri="http://schemas.openxmlformats.org/drawingml/2006/picture">
+                <pic:pic>
+                  <pic:nvPicPr>
+                    <pic:cNvPr id="0" name="fig3_empleo.png"/>
+                    <pic:cNvPicPr/>
+                  </pic:nvPicPr>
+                  <pic:blipFill>
+                    <a:blip r:embed="rId11"/>
+                    <a:stretch>
+                      <a:fillRect/>
+                    </a:stretch>
+                  </pic:blipFill>
+                  <pic:spPr>
+                    <a:xfrm>
+                      <a:off x="0" y="0"/>
+                      <a:ext cx="6035040" cy="3821530"/>
+                    </a:xfrm>
+                    <a:prstGeom prst="rect"/>
+                  </pic:spPr>
+                </pic:pic>
+              </a:graphicData>
+            </a:graphic>
+          </wp:inline>
+        </w:drawing>
+      </w:r>
+    </w:p>
+    <w:p>
+      <w:pPr>
         <w:sectPr>
           <w:pgSz w:w="15840" w:h="12240" w:orient="landscape"/>
           <w:pgMar w:top="907" w:right="907" w:bottom="907" w:left="907" w:header="720" w:footer="720" w:gutter="0"/>

</xml_diff>